<commit_message>
fix: 12-Output của KTC-Database bị đổi nhầm thành 30-Ket-Qua trong chỉ mục; quan-tri 1.3, plugin 0.4.1
Co-Authored-By: Claude Opus 5 <noreply@anthropic.com>
</commit_message>
<xml_diff>
--- a/92-Kinh-Nghiem/02-Regression/Fixtures/sua.docx
+++ b/92-Kinh-Nghiem/02-Regression/Fixtures/sua.docx
@@ -8,7 +8,7 @@
       </w:r>
     </w:p>
     <w:p>
-      <w:ins w:id="1006" w:author="Nội dung bổ sung (Claude)" w:date="2026-09-18T20:41:52Z">
+      <w:ins w:id="1006" w:author="Nội dung bổ sung (Claude)" w:date="2026-09-18T21:23:42Z">
         <w:r>
           <w:t xml:space="preserve">3.1. Cong tac tu van huong nghiep duoc trien khai som.</w:t>
         </w:r>
@@ -18,12 +18,12 @@
       <w:r>
         <w:t xml:space="preserve">Nam 2026 Nha truong tuyen duoc </w:t>
       </w:r>
-      <w:del w:id="1001" w:author="Nội dung điều chỉnh (Claude)" w:date="2026-09-18T20:41:52Z">
+      <w:del w:id="1001" w:author="Nội dung điều chỉnh (Claude)" w:date="2026-09-18T21:23:42Z">
         <w:r>
           <w:delText xml:space="preserve">2.000 hoc sinh</w:delText>
         </w:r>
       </w:del>
-      <w:ins w:id="1002" w:author="Nội dung điều chỉnh (Claude)" w:date="2026-09-18T20:41:52Z">
+      <w:ins w:id="1002" w:author="Nội dung điều chỉnh (Claude)" w:date="2026-09-18T21:23:42Z">
         <w:r>
           <w:t xml:space="preserve">2.150 hoc sinh</w:t>
         </w:r>
@@ -31,12 +31,12 @@
       <w:r>
         <w:t xml:space="preserve">, dat </w:t>
       </w:r>
-      <w:del w:id="1003" w:author="Nội dung điều chỉnh (Claude)" w:date="2026-09-18T20:41:52Z">
+      <w:del w:id="1003" w:author="Nội dung điều chỉnh (Claude)" w:date="2026-09-18T21:23:42Z">
         <w:r>
           <w:delText xml:space="preserve">80%</w:delText>
         </w:r>
       </w:del>
-      <w:ins w:id="1004" w:author="Nội dung điều chỉnh (Claude)" w:date="2026-09-18T20:41:52Z">
+      <w:ins w:id="1004" w:author="Nội dung điều chỉnh (Claude)" w:date="2026-09-18T21:23:42Z">
         <w:r>
           <w:t xml:space="preserve">86%</w:t>
         </w:r>
@@ -49,7 +49,7 @@
       <w:r>
         <w:t xml:space="preserve">Phong </w:t>
       </w:r>
-      <w:del w:id="1005" w:author="Nội dung bỏ (Claude)" w:date="2026-09-18T20:41:52Z">
+      <w:del w:id="1005" w:author="Nội dung bỏ (Claude)" w:date="2026-09-18T21:23:42Z">
         <w:r>
           <w:delText xml:space="preserve">da tham muu cho Lanh dao Truong </w:delText>
         </w:r>
@@ -102,14 +102,14 @@
       </w:tr>
       <w:tr>
         <w:trPr>
-          <w:del w:id="1007" w:author="Nội dung bỏ (Claude)" w:date="2026-09-18T20:41:52Z"/>
+          <w:del w:id="1007" w:author="Nội dung bỏ (Claude)" w:date="2026-09-18T21:23:42Z"/>
         </w:trPr>
         <w:tc>
           <w:tcPr>
             <w:tcW w:type="dxa" w:w="2880"/>
           </w:tcPr>
           <w:p>
-            <w:del w:id="1008" w:author="Nội dung bỏ (Claude)" w:date="2026-09-18T20:41:52Z">
+            <w:del w:id="1008" w:author="Nội dung bỏ (Claude)" w:date="2026-09-18T21:23:42Z">
               <w:r>
                 <w:delText>O10</w:delText>
               </w:r>
@@ -121,7 +121,7 @@
             <w:tcW w:type="dxa" w:w="2880"/>
           </w:tcPr>
           <w:p>
-            <w:del w:id="1009" w:author="Nội dung bỏ (Claude)" w:date="2026-09-18T20:41:52Z">
+            <w:del w:id="1009" w:author="Nội dung bỏ (Claude)" w:date="2026-09-18T21:23:42Z">
               <w:r>
                 <w:delText>O11</w:delText>
               </w:r>
@@ -133,7 +133,7 @@
             <w:tcW w:type="dxa" w:w="2880"/>
           </w:tcPr>
           <w:p>
-            <w:del w:id="1010" w:author="Nội dung bỏ (Claude)" w:date="2026-09-18T20:41:52Z">
+            <w:del w:id="1010" w:author="Nội dung bỏ (Claude)" w:date="2026-09-18T21:23:42Z">
               <w:r>
                 <w:delText>O12</w:delText>
               </w:r>

</xml_diff>

<commit_message>
feat: quy tắc viện dẫn văn bản — NĐ 30 · Pháp lệnh hợp nhất · quy ước Trường (DL-20260919-002)
- 20-Chuan-Chung/17-Quy-Tac-Vien-Dan.md + Nguyên tắc 5; VBHC: Luật/Pháp lệnh không ghi số hiệu kể cả khi có VBHN
- 29-Cong-Cu/kiem_vien_dan.py (VD01–VD12) + test hồi quy; checker C9
- 5 skill: quan-tri 1.7 · ke-hoach 3.8 · theo-doi-cv 1.6 · bao-cao 3.13 · soan-thao-vb 1.7; plugin 0.5.3

Co-Authored-By: Claude Opus 5 <noreply@anthropic.com>
</commit_message>
<xml_diff>
--- a/92-Kinh-Nghiem/02-Regression/Fixtures/sua.docx
+++ b/92-Kinh-Nghiem/02-Regression/Fixtures/sua.docx
@@ -8,7 +8,7 @@
       </w:r>
     </w:p>
     <w:p>
-      <w:ins w:id="1006" w:author="Nội dung bổ sung (Claude)" w:date="2026-09-18T21:23:42Z">
+      <w:ins w:id="1006" w:author="Nội dung bổ sung (Claude)" w:date="2026-09-19T12:14:31Z">
         <w:r>
           <w:t xml:space="preserve">3.1. Cong tac tu van huong nghiep duoc trien khai som.</w:t>
         </w:r>
@@ -18,12 +18,12 @@
       <w:r>
         <w:t xml:space="preserve">Nam 2026 Nha truong tuyen duoc </w:t>
       </w:r>
-      <w:del w:id="1001" w:author="Nội dung điều chỉnh (Claude)" w:date="2026-09-18T21:23:42Z">
+      <w:del w:id="1001" w:author="Nội dung điều chỉnh (Claude)" w:date="2026-09-19T12:14:31Z">
         <w:r>
           <w:delText xml:space="preserve">2.000 hoc sinh</w:delText>
         </w:r>
       </w:del>
-      <w:ins w:id="1002" w:author="Nội dung điều chỉnh (Claude)" w:date="2026-09-18T21:23:42Z">
+      <w:ins w:id="1002" w:author="Nội dung điều chỉnh (Claude)" w:date="2026-09-19T12:14:31Z">
         <w:r>
           <w:t xml:space="preserve">2.150 hoc sinh</w:t>
         </w:r>
@@ -31,12 +31,12 @@
       <w:r>
         <w:t xml:space="preserve">, dat </w:t>
       </w:r>
-      <w:del w:id="1003" w:author="Nội dung điều chỉnh (Claude)" w:date="2026-09-18T21:23:42Z">
+      <w:del w:id="1003" w:author="Nội dung điều chỉnh (Claude)" w:date="2026-09-19T12:14:31Z">
         <w:r>
           <w:delText xml:space="preserve">80%</w:delText>
         </w:r>
       </w:del>
-      <w:ins w:id="1004" w:author="Nội dung điều chỉnh (Claude)" w:date="2026-09-18T21:23:42Z">
+      <w:ins w:id="1004" w:author="Nội dung điều chỉnh (Claude)" w:date="2026-09-19T12:14:31Z">
         <w:r>
           <w:t xml:space="preserve">86%</w:t>
         </w:r>
@@ -49,7 +49,7 @@
       <w:r>
         <w:t xml:space="preserve">Phong </w:t>
       </w:r>
-      <w:del w:id="1005" w:author="Nội dung bỏ (Claude)" w:date="2026-09-18T21:23:42Z">
+      <w:del w:id="1005" w:author="Nội dung bỏ (Claude)" w:date="2026-09-19T12:14:31Z">
         <w:r>
           <w:delText xml:space="preserve">da tham muu cho Lanh dao Truong </w:delText>
         </w:r>
@@ -102,14 +102,14 @@
       </w:tr>
       <w:tr>
         <w:trPr>
-          <w:del w:id="1007" w:author="Nội dung bỏ (Claude)" w:date="2026-09-18T21:23:42Z"/>
+          <w:del w:id="1007" w:author="Nội dung bỏ (Claude)" w:date="2026-09-19T12:14:31Z"/>
         </w:trPr>
         <w:tc>
           <w:tcPr>
             <w:tcW w:type="dxa" w:w="2880"/>
           </w:tcPr>
           <w:p>
-            <w:del w:id="1008" w:author="Nội dung bỏ (Claude)" w:date="2026-09-18T21:23:42Z">
+            <w:del w:id="1008" w:author="Nội dung bỏ (Claude)" w:date="2026-09-19T12:14:31Z">
               <w:r>
                 <w:delText>O10</w:delText>
               </w:r>
@@ -121,7 +121,7 @@
             <w:tcW w:type="dxa" w:w="2880"/>
           </w:tcPr>
           <w:p>
-            <w:del w:id="1009" w:author="Nội dung bỏ (Claude)" w:date="2026-09-18T21:23:42Z">
+            <w:del w:id="1009" w:author="Nội dung bỏ (Claude)" w:date="2026-09-19T12:14:31Z">
               <w:r>
                 <w:delText>O11</w:delText>
               </w:r>
@@ -133,7 +133,7 @@
             <w:tcW w:type="dxa" w:w="2880"/>
           </w:tcPr>
           <w:p>
-            <w:del w:id="1010" w:author="Nội dung bỏ (Claude)" w:date="2026-09-18T21:23:42Z">
+            <w:del w:id="1010" w:author="Nội dung bỏ (Claude)" w:date="2026-09-19T12:14:31Z">
               <w:r>
                 <w:delText>O12</w:delText>
               </w:r>

</xml_diff>

<commit_message>
chore: dọn hệ — 27 gói .skill cũ + 4 plugin zip cũ vào 99-Luu-Tru; bản trùng Drive (1) của 31-Skill-Phu-Luc-TB736-Excel; quy ước giữ gói hiện hành + 1 bản trước
Co-Authored-By: Claude Opus 5 <noreply@anthropic.com>
</commit_message>
<xml_diff>
--- a/92-Kinh-Nghiem/02-Regression/Fixtures/sua.docx
+++ b/92-Kinh-Nghiem/02-Regression/Fixtures/sua.docx
@@ -8,7 +8,7 @@
       </w:r>
     </w:p>
     <w:p>
-      <w:ins w:id="1006" w:author="Nội dung bổ sung (Claude)" w:date="2026-09-19T12:14:31Z">
+      <w:ins w:id="1006" w:author="Nội dung bổ sung (Claude)" w:date="2026-09-19T20:48:45Z">
         <w:r>
           <w:t xml:space="preserve">3.1. Cong tac tu van huong nghiep duoc trien khai som.</w:t>
         </w:r>
@@ -18,12 +18,12 @@
       <w:r>
         <w:t xml:space="preserve">Nam 2026 Nha truong tuyen duoc </w:t>
       </w:r>
-      <w:del w:id="1001" w:author="Nội dung điều chỉnh (Claude)" w:date="2026-09-19T12:14:31Z">
+      <w:del w:id="1001" w:author="Nội dung điều chỉnh (Claude)" w:date="2026-09-19T20:48:45Z">
         <w:r>
           <w:delText xml:space="preserve">2.000 hoc sinh</w:delText>
         </w:r>
       </w:del>
-      <w:ins w:id="1002" w:author="Nội dung điều chỉnh (Claude)" w:date="2026-09-19T12:14:31Z">
+      <w:ins w:id="1002" w:author="Nội dung điều chỉnh (Claude)" w:date="2026-09-19T20:48:45Z">
         <w:r>
           <w:t xml:space="preserve">2.150 hoc sinh</w:t>
         </w:r>
@@ -31,12 +31,12 @@
       <w:r>
         <w:t xml:space="preserve">, dat </w:t>
       </w:r>
-      <w:del w:id="1003" w:author="Nội dung điều chỉnh (Claude)" w:date="2026-09-19T12:14:31Z">
+      <w:del w:id="1003" w:author="Nội dung điều chỉnh (Claude)" w:date="2026-09-19T20:48:45Z">
         <w:r>
           <w:delText xml:space="preserve">80%</w:delText>
         </w:r>
       </w:del>
-      <w:ins w:id="1004" w:author="Nội dung điều chỉnh (Claude)" w:date="2026-09-19T12:14:31Z">
+      <w:ins w:id="1004" w:author="Nội dung điều chỉnh (Claude)" w:date="2026-09-19T20:48:45Z">
         <w:r>
           <w:t xml:space="preserve">86%</w:t>
         </w:r>
@@ -49,7 +49,7 @@
       <w:r>
         <w:t xml:space="preserve">Phong </w:t>
       </w:r>
-      <w:del w:id="1005" w:author="Nội dung bỏ (Claude)" w:date="2026-09-19T12:14:31Z">
+      <w:del w:id="1005" w:author="Nội dung bỏ (Claude)" w:date="2026-09-19T20:48:45Z">
         <w:r>
           <w:delText xml:space="preserve">da tham muu cho Lanh dao Truong </w:delText>
         </w:r>
@@ -102,14 +102,14 @@
       </w:tr>
       <w:tr>
         <w:trPr>
-          <w:del w:id="1007" w:author="Nội dung bỏ (Claude)" w:date="2026-09-19T12:14:31Z"/>
+          <w:del w:id="1007" w:author="Nội dung bỏ (Claude)" w:date="2026-09-19T20:48:45Z"/>
         </w:trPr>
         <w:tc>
           <w:tcPr>
             <w:tcW w:type="dxa" w:w="2880"/>
           </w:tcPr>
           <w:p>
-            <w:del w:id="1008" w:author="Nội dung bỏ (Claude)" w:date="2026-09-19T12:14:31Z">
+            <w:del w:id="1008" w:author="Nội dung bỏ (Claude)" w:date="2026-09-19T20:48:45Z">
               <w:r>
                 <w:delText>O10</w:delText>
               </w:r>
@@ -121,7 +121,7 @@
             <w:tcW w:type="dxa" w:w="2880"/>
           </w:tcPr>
           <w:p>
-            <w:del w:id="1009" w:author="Nội dung bỏ (Claude)" w:date="2026-09-19T12:14:31Z">
+            <w:del w:id="1009" w:author="Nội dung bỏ (Claude)" w:date="2026-09-19T20:48:45Z">
               <w:r>
                 <w:delText>O11</w:delText>
               </w:r>
@@ -133,7 +133,7 @@
             <w:tcW w:type="dxa" w:w="2880"/>
           </w:tcPr>
           <w:p>
-            <w:del w:id="1010" w:author="Nội dung bỏ (Claude)" w:date="2026-09-19T12:14:31Z">
+            <w:del w:id="1010" w:author="Nội dung bỏ (Claude)" w:date="2026-09-19T20:48:45Z">
               <w:r>
                 <w:delText>O12</w:delText>
               </w:r>

</xml_diff>

<commit_message>
feat: vòng tự học — hook ghi lời người dùng + tín hiệu, agent ktc-tu-hoc, kho TRI-THUC nạp lại mỗi phiên (DL-20260919-005); 6 agent, plugin 0.8.0
Co-Authored-By: Claude Opus 5 <noreply@anthropic.com>
</commit_message>
<xml_diff>
--- a/92-Kinh-Nghiem/02-Regression/Fixtures/sua.docx
+++ b/92-Kinh-Nghiem/02-Regression/Fixtures/sua.docx
@@ -8,7 +8,7 @@
       </w:r>
     </w:p>
     <w:p>
-      <w:ins w:id="1006" w:author="Nội dung bổ sung (Claude)" w:date="2026-09-19T20:48:45Z">
+      <w:ins w:id="1006" w:author="Nội dung bổ sung (Claude)" w:date="2026-09-19T21:45:53Z">
         <w:r>
           <w:t xml:space="preserve">3.1. Cong tac tu van huong nghiep duoc trien khai som.</w:t>
         </w:r>
@@ -18,12 +18,12 @@
       <w:r>
         <w:t xml:space="preserve">Nam 2026 Nha truong tuyen duoc </w:t>
       </w:r>
-      <w:del w:id="1001" w:author="Nội dung điều chỉnh (Claude)" w:date="2026-09-19T20:48:45Z">
+      <w:del w:id="1001" w:author="Nội dung điều chỉnh (Claude)" w:date="2026-09-19T21:45:53Z">
         <w:r>
           <w:delText xml:space="preserve">2.000 hoc sinh</w:delText>
         </w:r>
       </w:del>
-      <w:ins w:id="1002" w:author="Nội dung điều chỉnh (Claude)" w:date="2026-09-19T20:48:45Z">
+      <w:ins w:id="1002" w:author="Nội dung điều chỉnh (Claude)" w:date="2026-09-19T21:45:53Z">
         <w:r>
           <w:t xml:space="preserve">2.150 hoc sinh</w:t>
         </w:r>
@@ -31,12 +31,12 @@
       <w:r>
         <w:t xml:space="preserve">, dat </w:t>
       </w:r>
-      <w:del w:id="1003" w:author="Nội dung điều chỉnh (Claude)" w:date="2026-09-19T20:48:45Z">
+      <w:del w:id="1003" w:author="Nội dung điều chỉnh (Claude)" w:date="2026-09-19T21:45:53Z">
         <w:r>
           <w:delText xml:space="preserve">80%</w:delText>
         </w:r>
       </w:del>
-      <w:ins w:id="1004" w:author="Nội dung điều chỉnh (Claude)" w:date="2026-09-19T20:48:45Z">
+      <w:ins w:id="1004" w:author="Nội dung điều chỉnh (Claude)" w:date="2026-09-19T21:45:53Z">
         <w:r>
           <w:t xml:space="preserve">86%</w:t>
         </w:r>
@@ -49,7 +49,7 @@
       <w:r>
         <w:t xml:space="preserve">Phong </w:t>
       </w:r>
-      <w:del w:id="1005" w:author="Nội dung bỏ (Claude)" w:date="2026-09-19T20:48:45Z">
+      <w:del w:id="1005" w:author="Nội dung bỏ (Claude)" w:date="2026-09-19T21:45:53Z">
         <w:r>
           <w:delText xml:space="preserve">da tham muu cho Lanh dao Truong </w:delText>
         </w:r>
@@ -102,14 +102,14 @@
       </w:tr>
       <w:tr>
         <w:trPr>
-          <w:del w:id="1007" w:author="Nội dung bỏ (Claude)" w:date="2026-09-19T20:48:45Z"/>
+          <w:del w:id="1007" w:author="Nội dung bỏ (Claude)" w:date="2026-09-19T21:45:53Z"/>
         </w:trPr>
         <w:tc>
           <w:tcPr>
             <w:tcW w:type="dxa" w:w="2880"/>
           </w:tcPr>
           <w:p>
-            <w:del w:id="1008" w:author="Nội dung bỏ (Claude)" w:date="2026-09-19T20:48:45Z">
+            <w:del w:id="1008" w:author="Nội dung bỏ (Claude)" w:date="2026-09-19T21:45:53Z">
               <w:r>
                 <w:delText>O10</w:delText>
               </w:r>
@@ -121,7 +121,7 @@
             <w:tcW w:type="dxa" w:w="2880"/>
           </w:tcPr>
           <w:p>
-            <w:del w:id="1009" w:author="Nội dung bỏ (Claude)" w:date="2026-09-19T20:48:45Z">
+            <w:del w:id="1009" w:author="Nội dung bỏ (Claude)" w:date="2026-09-19T21:45:53Z">
               <w:r>
                 <w:delText>O11</w:delText>
               </w:r>
@@ -133,7 +133,7 @@
             <w:tcW w:type="dxa" w:w="2880"/>
           </w:tcPr>
           <w:p>
-            <w:del w:id="1010" w:author="Nội dung bỏ (Claude)" w:date="2026-09-19T20:48:45Z">
+            <w:del w:id="1010" w:author="Nội dung bỏ (Claude)" w:date="2026-09-19T21:45:53Z">
               <w:r>
                 <w:delText>O12</w:delText>
               </w:r>

</xml_diff>